<commit_message>
Updated wording of iac automation gui
</commit_message>
<xml_diff>
--- a/Report/Description.docx
+++ b/Report/Description.docx
@@ -17,7 +17,19 @@
         <w:jc w:val="both"/>
       </w:pPr>
       <w:r>
-        <w:t>Tobyhanna Army Depot specialized in full life cycle support for many military electronics systems – from fabrication to aftermarket support to repair</w:t>
+        <w:t>Viscofan</w:t>
+      </w:r>
+      <w:r>
+        <w:t xml:space="preserve"> specialize</w:t>
+      </w:r>
+      <w:r>
+        <w:t>s</w:t>
+      </w:r>
+      <w:r>
+        <w:t xml:space="preserve"> </w:t>
+      </w:r>
+      <w:r>
+        <w:t>in production and distribution of artificial meat casings for the meat industry</w:t>
       </w:r>
     </w:p>
     <w:p>
@@ -57,21 +69,11 @@
       <w:r>
         <w:t xml:space="preserve">Figure </w:t>
       </w:r>
-      <w:r>
-        <w:fldChar w:fldCharType="begin"/>
-      </w:r>
-      <w:r>
-        <w:instrText xml:space="preserve"> SEQ Figure \* ARABIC </w:instrText>
-      </w:r>
-      <w:r>
-        <w:fldChar w:fldCharType="separate"/>
-      </w:r>
-      <w:r>
-        <w:t>1</w:t>
-      </w:r>
-      <w:r>
-        <w:fldChar w:fldCharType="end"/>
-      </w:r>
+      <w:fldSimple w:instr=" SEQ Figure \* ARABIC ">
+        <w:r>
+          <w:t>1</w:t>
+        </w:r>
+      </w:fldSimple>
       <w:r>
         <w:t xml:space="preserve">: </w:t>
       </w:r>
@@ -313,9 +315,6 @@
             <w:r>
               <w:t>1</w:t>
             </w:r>
-            <w:r>
-              <w:t>5</w:t>
-            </w:r>
           </w:p>
         </w:tc>
         <w:tc>
@@ -328,7 +327,13 @@
               <w:jc w:val="center"/>
             </w:pPr>
             <w:r>
-              <w:t xml:space="preserve">2,240 </w:t>
+              <w:t>2</w:t>
+            </w:r>
+            <w:r>
+              <w:t>50</w:t>
+            </w:r>
+            <w:r>
+              <w:t xml:space="preserve"> </w:t>
             </w:r>
             <w:r>
               <w:t>HP</w:t>
@@ -345,7 +350,7 @@
               <w:jc w:val="center"/>
             </w:pPr>
             <w:r>
-              <w:t>11,546,218</w:t>
+              <w:t>1,629,264</w:t>
             </w:r>
             <w:r>
               <w:t xml:space="preserve"> </w:t>
@@ -368,7 +373,13 @@
               <w:t>$</w:t>
             </w:r>
             <w:r>
-              <w:t>987,143</w:t>
+              <w:t>192</w:t>
+            </w:r>
+            <w:r>
+              <w:t>,</w:t>
+            </w:r>
+            <w:r>
+              <w:t>253</w:t>
             </w:r>
           </w:p>
         </w:tc>
@@ -401,7 +412,7 @@
               <w:jc w:val="center"/>
             </w:pPr>
             <w:r>
-              <w:t>600</w:t>
+              <w:t>3</w:t>
             </w:r>
           </w:p>
         </w:tc>
@@ -415,7 +426,10 @@
               <w:jc w:val="center"/>
             </w:pPr>
             <w:r>
-              <w:t>618.5 Tons</w:t>
+              <w:t>180</w:t>
+            </w:r>
+            <w:r>
+              <w:t xml:space="preserve"> Tons</w:t>
             </w:r>
           </w:p>
         </w:tc>
@@ -429,7 +443,7 @@
               <w:jc w:val="center"/>
             </w:pPr>
             <w:r>
-              <w:t>22,937,381 kWh</w:t>
+              <w:t>794,539.2 kWh</w:t>
             </w:r>
           </w:p>
         </w:tc>
@@ -443,7 +457,7 @@
               <w:jc w:val="center"/>
             </w:pPr>
             <w:r>
-              <w:t>$1,559,741</w:t>
+              <w:t>$93,755.62</w:t>
             </w:r>
           </w:p>
         </w:tc>
@@ -457,24 +471,14 @@
       <w:r>
         <w:t xml:space="preserve">Table </w:t>
       </w:r>
-      <w:r>
-        <w:fldChar w:fldCharType="begin"/>
-      </w:r>
-      <w:r>
-        <w:instrText xml:space="preserve"> SEQ Table \* ARABIC </w:instrText>
-      </w:r>
-      <w:r>
-        <w:fldChar w:fldCharType="separate"/>
-      </w:r>
-      <w:r>
-        <w:rPr>
-          <w:noProof/>
-        </w:rPr>
-        <w:t>4</w:t>
-      </w:r>
-      <w:r>
-        <w:fldChar w:fldCharType="end"/>
-      </w:r>
+      <w:fldSimple w:instr=" SEQ Table \* ARABIC ">
+        <w:r>
+          <w:rPr>
+            <w:noProof/>
+          </w:rPr>
+          <w:t>4</w:t>
+        </w:r>
+      </w:fldSimple>
       <w:r>
         <w:t xml:space="preserve">: </w:t>
       </w:r>
@@ -514,13 +518,8 @@
         <w:spacing w:line="360" w:lineRule="auto"/>
         <w:jc w:val="both"/>
       </w:pPr>
-      <w:proofErr w:type="gramStart"/>
       <w:r>
-        <w:t>Installed LED lights</w:t>
-      </w:r>
-      <w:proofErr w:type="gramEnd"/>
-      <w:r>
-        <w:t xml:space="preserve"> in some buildings and manufacturing areas</w:t>
+        <w:t>Plan to be part of ISO 5001 next year</w:t>
       </w:r>
     </w:p>
     <w:p>
@@ -534,14 +533,34 @@
         <w:jc w:val="both"/>
       </w:pPr>
       <w:r>
-        <w:t>Well Labeled Infrastructure</w:t>
+        <w:t>Focus on use of electric forklifts to save energy</w:t>
       </w:r>
     </w:p>
     <w:p>
       <w:pPr>
+        <w:pStyle w:val="ListParagraph"/>
+        <w:numPr>
+          <w:ilvl w:val="0"/>
+          <w:numId w:val="20"/>
+        </w:numPr>
         <w:spacing w:line="360" w:lineRule="auto"/>
         <w:jc w:val="both"/>
       </w:pPr>
+      <w:r>
+        <w:t xml:space="preserve">More than half of </w:t>
+      </w:r>
+      <w:r>
+        <w:t>the lighting</w:t>
+      </w:r>
+      <w:r>
+        <w:t xml:space="preserve"> are</w:t>
+      </w:r>
+      <w:r>
+        <w:t xml:space="preserve"> already</w:t>
+      </w:r>
+      <w:r>
+        <w:t xml:space="preserve"> LED fixtures</w:t>
+      </w:r>
     </w:p>
     <w:p>
       <w:pPr>
@@ -567,24 +586,14 @@
         <w:lastRenderedPageBreak/>
         <w:t xml:space="preserve">Figure </w:t>
       </w:r>
-      <w:r>
-        <w:fldChar w:fldCharType="begin"/>
-      </w:r>
-      <w:r>
-        <w:instrText xml:space="preserve"> SEQ Figure \* ARABIC </w:instrText>
-      </w:r>
-      <w:r>
-        <w:fldChar w:fldCharType="separate"/>
-      </w:r>
-      <w:r>
-        <w:rPr>
-          <w:noProof/>
-        </w:rPr>
-        <w:t>2</w:t>
-      </w:r>
-      <w:r>
-        <w:fldChar w:fldCharType="end"/>
-      </w:r>
+      <w:fldSimple w:instr=" SEQ Figure \* ARABIC ">
+        <w:r>
+          <w:rPr>
+            <w:noProof/>
+          </w:rPr>
+          <w:t>2</w:t>
+        </w:r>
+      </w:fldSimple>
       <w:r>
         <w:t xml:space="preserve">: </w:t>
       </w:r>
@@ -604,11 +613,130 @@
     </w:p>
     <w:p>
       <w:r>
+        <w:rPr>
+          <w:noProof/>
+        </w:rPr>
+        <mc:AlternateContent>
+          <mc:Choice Requires="wps">
+            <w:drawing>
+              <wp:anchor distT="0" distB="0" distL="114300" distR="114300" simplePos="0" relativeHeight="251659264" behindDoc="0" locked="0" layoutInCell="1" allowOverlap="1" wp14:anchorId="0A88E336" wp14:editId="54F1063A">
+                <wp:simplePos x="0" y="0"/>
+                <wp:positionH relativeFrom="column">
+                  <wp:posOffset>1695132</wp:posOffset>
+                </wp:positionH>
+                <wp:positionV relativeFrom="paragraph">
+                  <wp:posOffset>3101022</wp:posOffset>
+                </wp:positionV>
+                <wp:extent cx="1785937" cy="519113"/>
+                <wp:effectExtent l="57150" t="152400" r="43180" b="167005"/>
+                <wp:wrapNone/>
+                <wp:docPr id="1263389114" name="Text Box 1"/>
+                <wp:cNvGraphicFramePr/>
+                <a:graphic xmlns:a="http://schemas.openxmlformats.org/drawingml/2006/main">
+                  <a:graphicData uri="http://schemas.microsoft.com/office/word/2010/wordprocessingShape">
+                    <wps:wsp>
+                      <wps:cNvSpPr txBox="1"/>
+                      <wps:spPr>
+                        <a:xfrm rot="553201">
+                          <a:off x="0" y="0"/>
+                          <a:ext cx="1785937" cy="519113"/>
+                        </a:xfrm>
+                        <a:prstGeom prst="rect">
+                          <a:avLst/>
+                        </a:prstGeom>
+                        <a:noFill/>
+                        <a:ln w="6350">
+                          <a:solidFill>
+                            <a:prstClr val="black"/>
+                          </a:solidFill>
+                        </a:ln>
+                      </wps:spPr>
+                      <wps:txbx>
+                        <w:txbxContent>
+                          <w:p>
+                            <w:pPr>
+                              <w:rPr>
+                                <w:b/>
+                                <w:bCs/>
+                                <w:color w:val="EE0000"/>
+                                <w:sz w:val="44"/>
+                                <w:szCs w:val="44"/>
+                              </w:rPr>
+                            </w:pPr>
+                            <w:r>
+                              <w:rPr>
+                                <w:b/>
+                                <w:bCs/>
+                                <w:color w:val="EE0000"/>
+                                <w:sz w:val="44"/>
+                                <w:szCs w:val="44"/>
+                              </w:rPr>
+                              <w:t>Office Area</w:t>
+                            </w:r>
+                          </w:p>
+                        </w:txbxContent>
+                      </wps:txbx>
+                      <wps:bodyPr rot="0" spcFirstLastPara="0" vertOverflow="overflow" horzOverflow="overflow" vert="horz" wrap="square" lIns="91440" tIns="45720" rIns="91440" bIns="45720" numCol="1" spcCol="0" rtlCol="0" fromWordArt="0" anchor="t" anchorCtr="0" forceAA="0" compatLnSpc="1">
+                        <a:prstTxWarp prst="textNoShape">
+                          <a:avLst/>
+                        </a:prstTxWarp>
+                        <a:noAutofit/>
+                      </wps:bodyPr>
+                    </wps:wsp>
+                  </a:graphicData>
+                </a:graphic>
+                <wp14:sizeRelH relativeFrom="margin">
+                  <wp14:pctWidth>0</wp14:pctWidth>
+                </wp14:sizeRelH>
+              </wp:anchor>
+            </w:drawing>
+          </mc:Choice>
+          <mc:Fallback>
+            <w:pict>
+              <v:shapetype w14:anchorId="0A88E336" id="_x0000_t202" coordsize="21600,21600" o:spt="202" path="m,l,21600r21600,l21600,xe">
+                <v:stroke joinstyle="miter"/>
+                <v:path gradientshapeok="t" o:connecttype="rect"/>
+              </v:shapetype>
+              <v:shape id="Text Box 1" o:spid="_x0000_s1026" type="#_x0000_t202" style="position:absolute;margin-left:133.45pt;margin-top:244.15pt;width:140.6pt;height:40.9pt;rotation:604243fd;z-index:251659264;visibility:visible;mso-wrap-style:square;mso-width-percent:0;mso-wrap-distance-left:9pt;mso-wrap-distance-top:0;mso-wrap-distance-right:9pt;mso-wrap-distance-bottom:0;mso-position-horizontal:absolute;mso-position-horizontal-relative:text;mso-position-vertical:absolute;mso-position-vertical-relative:text;mso-width-percent:0;mso-width-relative:margin;v-text-anchor:top" o:gfxdata="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" filled="f" strokeweight=".5pt">
+                <v:textbox>
+                  <w:txbxContent>
+                    <w:p>
+                      <w:pPr>
+                        <w:rPr>
+                          <w:b/>
+                          <w:bCs/>
+                          <w:color w:val="EE0000"/>
+                          <w:sz w:val="44"/>
+                          <w:szCs w:val="44"/>
+                        </w:rPr>
+                      </w:pPr>
+                      <w:r>
+                        <w:rPr>
+                          <w:b/>
+                          <w:bCs/>
+                          <w:color w:val="EE0000"/>
+                          <w:sz w:val="44"/>
+                          <w:szCs w:val="44"/>
+                        </w:rPr>
+                        <w:t>Office Area</w:t>
+                      </w:r>
+                    </w:p>
+                  </w:txbxContent>
+                </v:textbox>
+              </v:shape>
+            </w:pict>
+          </mc:Fallback>
+        </mc:AlternateContent>
+      </w:r>
+      <w:r>
+        <w:rPr>
+          <w:noProof/>
+        </w:rPr>
         <w:drawing>
-          <wp:inline distT="0" distB="0" distL="0" distR="0" wp14:anchorId="724B0452" wp14:editId="7ACFFEA0">
-            <wp:extent cx="5943600" cy="3848735"/>
+          <wp:inline distT="0" distB="0" distL="0" distR="0" wp14:anchorId="0100799C" wp14:editId="115B4440">
+            <wp:extent cx="5943600" cy="6085840"/>
             <wp:effectExtent l="0" t="0" r="0" b="0"/>
-            <wp:docPr id="2069259142" name="Picture 1" descr="A map of a city&#10;&#10;AI-generated content may be incorrect."/>
+            <wp:docPr id="776946545" name="Picture 1" descr="Aerial view of a building&#10;&#10;AI-generated content may be incorrect."/>
             <wp:cNvGraphicFramePr>
               <a:graphicFrameLocks xmlns:a="http://schemas.openxmlformats.org/drawingml/2006/main" noChangeAspect="1"/>
             </wp:cNvGraphicFramePr>
@@ -616,7 +744,7 @@
               <a:graphicData uri="http://schemas.openxmlformats.org/drawingml/2006/picture">
                 <pic:pic xmlns:pic="http://schemas.openxmlformats.org/drawingml/2006/picture">
                   <pic:nvPicPr>
-                    <pic:cNvPr id="2069259142" name="Picture 1" descr="A map of a city&#10;&#10;AI-generated content may be incorrect."/>
+                    <pic:cNvPr id="776946545" name="Picture 1" descr="Aerial view of a building&#10;&#10;AI-generated content may be incorrect."/>
                     <pic:cNvPicPr/>
                   </pic:nvPicPr>
                   <pic:blipFill>
@@ -628,7 +756,7 @@
                   <pic:spPr>
                     <a:xfrm>
                       <a:off x="0" y="0"/>
-                      <a:ext cx="5943600" cy="3848735"/>
+                      <a:ext cx="5943600" cy="6085840"/>
                     </a:xfrm>
                     <a:prstGeom prst="rect">
                       <a:avLst/>
@@ -3606,6 +3734,7 @@
   <w:style w:type="character" w:default="1" w:styleId="DefaultParagraphFont">
     <w:name w:val="Default Paragraph Font"/>
     <w:uiPriority w:val="1"/>
+    <w:semiHidden/>
     <w:unhideWhenUsed/>
   </w:style>
   <w:style w:type="table" w:default="1" w:styleId="TableNormal">

</xml_diff>